<commit_message>
Completed 5.5. ASR Evaluation, OCR config experiments, OCR batch rec/dec
</commit_message>
<xml_diff>
--- a/assets/essays/trait level annotations.docx
+++ b/assets/essays/trait level annotations.docx
@@ -180,16 +180,18 @@
             <w:r>
               <w:t>The writing lacks a central idea or purpose. The writing is characterized by</w:t>
             </w:r>
-          </w:p>
-          <w:p>
+            <w:r>
+              <w:t xml:space="preserve"> </w:t>
+            </w:r>
             <w:r>
               <w:t>a)</w:t>
             </w:r>
             <w:r>
               <w:t xml:space="preserve"> ideas that are extremely limited or simply unclear.</w:t>
             </w:r>
-          </w:p>
-          <w:p>
+            <w:r>
+              <w:t xml:space="preserve"> </w:t>
+            </w:r>
             <w:r>
               <w:t>b)</w:t>
             </w:r>
@@ -205,8 +207,9 @@
             <w:r>
               <w:t xml:space="preserve"> the paper is too short to</w:t>
             </w:r>
-          </w:p>
-          <w:p>
+            <w:r>
+              <w:t xml:space="preserve"> </w:t>
+            </w:r>
             <w:r>
               <w:t>demonstrate the development of an idea.</w:t>
             </w:r>
@@ -218,23 +221,34 @@
           </w:tcPr>
           <w:p>
             <w:r>
-              <w:t>Main ideas and purpose are somewhat unclear or development is attempted but</w:t>
-            </w:r>
-          </w:p>
-          <w:p>
+              <w:t xml:space="preserve">Main ideas and purpose are somewhat </w:t>
+            </w:r>
+            <w:proofErr w:type="gramStart"/>
+            <w:r>
+              <w:t>unclear</w:t>
+            </w:r>
+            <w:proofErr w:type="gramEnd"/>
+            <w:r>
+              <w:t xml:space="preserve"> or development is attempted but</w:t>
+            </w:r>
+            <w:r>
+              <w:t xml:space="preserve"> </w:t>
+            </w:r>
             <w:r>
               <w:t>minimal. The writing is characterized by</w:t>
             </w:r>
-          </w:p>
-          <w:p>
+            <w:r>
+              <w:t xml:space="preserve"> </w:t>
+            </w:r>
             <w:r>
               <w:t>a)</w:t>
             </w:r>
             <w:r>
               <w:t xml:space="preserve"> a purpose and main idea(s) that may require extensive inferences by the reader.</w:t>
             </w:r>
-          </w:p>
-          <w:p>
+            <w:r>
+              <w:t xml:space="preserve"> </w:t>
+            </w:r>
             <w:r>
               <w:t xml:space="preserve">b) </w:t>
             </w:r>
@@ -247,16 +261,18 @@
             <w:r>
               <w:t>insufficient details.</w:t>
             </w:r>
-          </w:p>
-          <w:p>
+            <w:r>
+              <w:t xml:space="preserve"> </w:t>
+            </w:r>
             <w:r>
               <w:t xml:space="preserve">c) </w:t>
             </w:r>
             <w:r>
               <w:t>irrelevant details that clutter the text.</w:t>
             </w:r>
-          </w:p>
-          <w:p>
+            <w:r>
+              <w:t xml:space="preserve"> </w:t>
+            </w:r>
             <w:r>
               <w:t xml:space="preserve">d) </w:t>
             </w:r>
@@ -273,13 +289,15 @@
             <w:r>
               <w:t>The reader can understand the main ideas, although they may be overly broad or</w:t>
             </w:r>
-          </w:p>
-          <w:p>
+            <w:r>
+              <w:t xml:space="preserve"> </w:t>
+            </w:r>
             <w:r>
               <w:t>simplistic, and the results may not be effective. Supporting detail is often limited, insubstantial,</w:t>
             </w:r>
-          </w:p>
-          <w:p>
+            <w:r>
+              <w:t xml:space="preserve"> </w:t>
+            </w:r>
             <w:r>
               <w:t xml:space="preserve">overly general, or occasionally slightly </w:t>
             </w:r>
@@ -289,16 +307,18 @@
             <w:r>
               <w:t>. The writing is characterized by</w:t>
             </w:r>
-          </w:p>
-          <w:p>
+            <w:r>
+              <w:t xml:space="preserve"> </w:t>
+            </w:r>
             <w:r>
               <w:t>a)</w:t>
             </w:r>
             <w:r>
               <w:t xml:space="preserve"> an easily identifiable purpose and main idea(s).</w:t>
             </w:r>
-          </w:p>
-          <w:p>
+            <w:r>
+              <w:t xml:space="preserve"> </w:t>
+            </w:r>
             <w:r>
               <w:t>b)</w:t>
             </w:r>
@@ -317,8 +337,9 @@
             <w:r>
               <w:t xml:space="preserve"> or points that echo observations heard</w:t>
             </w:r>
-          </w:p>
-          <w:p>
+            <w:r>
+              <w:t xml:space="preserve"> </w:t>
+            </w:r>
             <w:r>
               <w:t>elsewhere</w:t>
             </w:r>
@@ -328,16 +349,18 @@
             <w:r>
               <w:t xml:space="preserve"> or a close retelling of another work.</w:t>
             </w:r>
-          </w:p>
-          <w:p>
+            <w:r>
+              <w:t xml:space="preserve"> </w:t>
+            </w:r>
             <w:r>
               <w:t>c)</w:t>
             </w:r>
             <w:r>
               <w:t xml:space="preserve"> support that is attempted, but developmental details are often limited, uneven,</w:t>
             </w:r>
-          </w:p>
-          <w:p>
+            <w:r>
+              <w:t xml:space="preserve"> </w:t>
+            </w:r>
             <w:r>
               <w:t>somewhat off-topic, predictable, or too general (</w:t>
             </w:r>
@@ -345,14 +368,15 @@
               <w:t>for example</w:t>
             </w:r>
             <w:r>
-              <w:t xml:space="preserve"> </w:t>
+              <w:t xml:space="preserve"> a list of </w:t>
             </w:r>
             <w:r>
               <w:lastRenderedPageBreak/>
-              <w:t>a list of underdeveloped points).</w:t>
-            </w:r>
-          </w:p>
-          <w:p>
+              <w:t>underdeveloped points).</w:t>
+            </w:r>
+            <w:r>
+              <w:t xml:space="preserve"> </w:t>
+            </w:r>
             <w:r>
               <w:t>d)</w:t>
             </w:r>
@@ -365,13 +389,15 @@
             <w:r>
               <w:t xml:space="preserve"> they may be based</w:t>
             </w:r>
-          </w:p>
-          <w:p>
+            <w:r>
+              <w:t xml:space="preserve"> </w:t>
+            </w:r>
             <w:r>
               <w:t>on clichés, stereotypes or questionable sources of information.</w:t>
             </w:r>
-          </w:p>
-          <w:p>
+            <w:r>
+              <w:t xml:space="preserve"> </w:t>
+            </w:r>
             <w:r>
               <w:t>d)</w:t>
             </w:r>
@@ -389,37 +415,42 @@
               <w:lastRenderedPageBreak/>
               <w:t>The writing is clear and focused. The reader can easily understand the main ideas.</w:t>
             </w:r>
-          </w:p>
-          <w:p>
+            <w:r>
+              <w:t xml:space="preserve"> </w:t>
+            </w:r>
             <w:r>
               <w:t>Support is present, although it may be limited or rather general. The writing is characterized by</w:t>
             </w:r>
-          </w:p>
-          <w:p>
+            <w:r>
+              <w:t xml:space="preserve"> </w:t>
+            </w:r>
             <w:r>
               <w:t>a)</w:t>
             </w:r>
             <w:r>
               <w:t xml:space="preserve"> an easily identifiable purpose.</w:t>
             </w:r>
-          </w:p>
-          <w:p>
+            <w:r>
+              <w:t xml:space="preserve"> </w:t>
+            </w:r>
             <w:r>
               <w:t>b)</w:t>
             </w:r>
             <w:r>
               <w:t xml:space="preserve"> clear main idea(s).</w:t>
             </w:r>
-          </w:p>
-          <w:p>
+            <w:r>
+              <w:t xml:space="preserve"> </w:t>
+            </w:r>
             <w:r>
               <w:t>c)</w:t>
             </w:r>
             <w:r>
               <w:t xml:space="preserve"> supporting details that are relevant, but may be overly general or limited in</w:t>
             </w:r>
-          </w:p>
-          <w:p>
+            <w:r>
+              <w:t xml:space="preserve"> </w:t>
+            </w:r>
             <w:r>
               <w:t>places</w:t>
             </w:r>
@@ -429,8 +460,9 @@
             <w:r>
               <w:t xml:space="preserve"> when appropriate, resources are used to provide accurate support.</w:t>
             </w:r>
-          </w:p>
-          <w:p>
+            <w:r>
+              <w:t xml:space="preserve"> </w:t>
+            </w:r>
             <w:r>
               <w:t>d)</w:t>
             </w:r>
@@ -443,8 +475,9 @@
             <w:r>
               <w:t xml:space="preserve"> explained, although developmental details may</w:t>
             </w:r>
-          </w:p>
-          <w:p>
+            <w:r>
+              <w:t xml:space="preserve"> </w:t>
+            </w:r>
             <w:r>
               <w:t>occasionally be out of balance with the main idea(s)</w:t>
             </w:r>
@@ -454,22 +487,28 @@
             <w:r>
               <w:t>some connections and insights may be</w:t>
             </w:r>
-          </w:p>
-          <w:p>
+            <w:r>
+              <w:t xml:space="preserve"> </w:t>
+            </w:r>
+            <w:r>
+              <w:t>present.</w:t>
+            </w:r>
+            <w:r>
+              <w:t xml:space="preserve"> </w:t>
+            </w:r>
+            <w:r>
+              <w:t xml:space="preserve">e) </w:t>
+            </w:r>
+            <w:r>
+              <w:t xml:space="preserve">content and selected details that are relevant, </w:t>
+            </w:r>
             <w:r>
               <w:lastRenderedPageBreak/>
-              <w:t>present.</w:t>
-            </w:r>
-          </w:p>
-          <w:p>
-            <w:r>
-              <w:t xml:space="preserve">e) </w:t>
-            </w:r>
-            <w:r>
-              <w:t>content and selected details that are relevant, but perhaps not consistently</w:t>
-            </w:r>
-          </w:p>
-          <w:p>
+              <w:t>but perhaps not consistently</w:t>
+            </w:r>
+            <w:r>
+              <w:t xml:space="preserve"> </w:t>
+            </w:r>
             <w:r>
               <w:t>well-chosen for audience and purpose.</w:t>
             </w:r>
@@ -484,34 +523,39 @@
               <w:lastRenderedPageBreak/>
               <w:t>The writing is clear, focused and interesting. It holds the reader’s attention. Main ideas</w:t>
             </w:r>
-          </w:p>
-          <w:p>
+            <w:r>
+              <w:t xml:space="preserve"> </w:t>
+            </w:r>
             <w:r>
               <w:t>stand out and are developed by supporting details suitable to audience and purpose. The</w:t>
             </w:r>
-          </w:p>
-          <w:p>
+            <w:r>
+              <w:t xml:space="preserve"> </w:t>
+            </w:r>
             <w:r>
               <w:t>writing is characterized by</w:t>
             </w:r>
-          </w:p>
-          <w:p>
+            <w:r>
+              <w:t xml:space="preserve"> </w:t>
+            </w:r>
             <w:r>
               <w:t>a)</w:t>
             </w:r>
             <w:r>
               <w:t xml:space="preserve"> clarity, focus, and control.</w:t>
             </w:r>
-          </w:p>
-          <w:p>
+            <w:r>
+              <w:t xml:space="preserve"> </w:t>
+            </w:r>
             <w:r>
               <w:t>b)</w:t>
             </w:r>
             <w:r>
               <w:t xml:space="preserve"> main idea(s) that stand out.</w:t>
             </w:r>
-          </w:p>
-          <w:p>
+            <w:r>
+              <w:t xml:space="preserve"> </w:t>
+            </w:r>
             <w:r>
               <w:t>c)</w:t>
             </w:r>
@@ -524,13 +568,15 @@
             <w:r>
               <w:t xml:space="preserve"> when appropriate, use of</w:t>
             </w:r>
-          </w:p>
-          <w:p>
+            <w:r>
+              <w:t xml:space="preserve"> </w:t>
+            </w:r>
             <w:r>
               <w:t>resources provides strong, accurate, credible support.</w:t>
             </w:r>
-          </w:p>
-          <w:p>
+            <w:r>
+              <w:t xml:space="preserve"> </w:t>
+            </w:r>
             <w:r>
               <w:t>d)</w:t>
             </w:r>
@@ -549,109 +595,121 @@
             <w:r>
               <w:t xml:space="preserve"> the writing makes</w:t>
             </w:r>
-          </w:p>
-          <w:p>
+            <w:r>
+              <w:t xml:space="preserve"> </w:t>
+            </w:r>
             <w:r>
               <w:t>connections and shares insights.</w:t>
             </w:r>
-          </w:p>
-          <w:p>
+            <w:r>
+              <w:t xml:space="preserve"> </w:t>
+            </w:r>
+            <w:r>
+              <w:t>e)</w:t>
+            </w:r>
+            <w:r>
+              <w:t xml:space="preserve"> content and selected details that are well-suited to audience and purpose.</w:t>
+            </w:r>
+          </w:p>
+        </w:tc>
+        <w:tc>
+          <w:tcPr>
+            <w:tcW w:w="625" w:type="pct"/>
+          </w:tcPr>
+          <w:p>
+            <w:r>
+              <w:t>The writing is exceptionally clear, focused, and interesting. It holds the reader’s</w:t>
+            </w:r>
+            <w:r>
+              <w:t xml:space="preserve"> </w:t>
+            </w:r>
+            <w:r>
+              <w:t>attention throughout. Main ideas stand out and are developed by strong support and rich details</w:t>
+            </w:r>
+            <w:r>
+              <w:t xml:space="preserve"> </w:t>
+            </w:r>
+            <w:r>
+              <w:t>suitable to audience and purpose. The writing is characterized by</w:t>
+            </w:r>
+            <w:r>
+              <w:t xml:space="preserve"> </w:t>
+            </w:r>
+            <w:r>
+              <w:t>a)</w:t>
+            </w:r>
+            <w:r>
+              <w:t xml:space="preserve"> clarity, focus, and control.</w:t>
+            </w:r>
+            <w:r>
+              <w:t xml:space="preserve"> </w:t>
+            </w:r>
+            <w:r>
+              <w:t>b)</w:t>
+            </w:r>
+            <w:r>
+              <w:t xml:space="preserve"> main idea(s) that stand out.</w:t>
+            </w:r>
+            <w:r>
+              <w:t xml:space="preserve"> </w:t>
+            </w:r>
+            <w:r>
+              <w:t>c)</w:t>
+            </w:r>
+            <w:r>
+              <w:t xml:space="preserve"> supporting, relevant, carefully selected details</w:t>
+            </w:r>
+            <w:r>
+              <w:t>,</w:t>
+            </w:r>
+            <w:r>
+              <w:t xml:space="preserve"> when appropriate, use of</w:t>
+            </w:r>
+            <w:r>
+              <w:t xml:space="preserve"> </w:t>
+            </w:r>
+            <w:r>
+              <w:t>resources provides strong, accurate, credible support.</w:t>
+            </w:r>
+            <w:r>
+              <w:t xml:space="preserve"> </w:t>
+            </w:r>
+            <w:r>
+              <w:t>d)</w:t>
+            </w:r>
+            <w:r>
+              <w:t xml:space="preserve"> a thorough, balanced, in-depth explanation </w:t>
+            </w:r>
+            <w:r>
+              <w:t>or</w:t>
+            </w:r>
+            <w:r>
+              <w:t xml:space="preserve"> exploration of the topic</w:t>
+            </w:r>
+            <w:r>
+              <w:t>,</w:t>
+            </w:r>
+            <w:r>
+              <w:t xml:space="preserve"> the writing</w:t>
+            </w:r>
+            <w:r>
+              <w:t xml:space="preserve"> </w:t>
+            </w:r>
+            <w:r>
+              <w:t>makes connections and shares insights.</w:t>
+            </w:r>
+            <w:r>
+              <w:t xml:space="preserve"> </w:t>
+            </w:r>
+            <w:r>
+              <w:t>e)</w:t>
+            </w:r>
+            <w:r>
+              <w:t xml:space="preserve"> content and selected details that </w:t>
+            </w:r>
             <w:r>
               <w:lastRenderedPageBreak/>
-              <w:t>e)</w:t>
-            </w:r>
-            <w:r>
-              <w:t xml:space="preserve"> content and selected details that are well-suited to audience and purpose.</w:t>
-            </w:r>
-          </w:p>
-        </w:tc>
-        <w:tc>
-          <w:tcPr>
-            <w:tcW w:w="625" w:type="pct"/>
-          </w:tcPr>
-          <w:p>
-            <w:r>
-              <w:lastRenderedPageBreak/>
-              <w:t>The writing is exceptionally clear, focused, and interesting. It holds the reader’s</w:t>
-            </w:r>
-          </w:p>
-          <w:p>
-            <w:r>
-              <w:t>attention throughout. Main ideas stand out and are developed by strong support and rich details</w:t>
-            </w:r>
-          </w:p>
-          <w:p>
-            <w:r>
-              <w:t>suitable to audience and purpose. The writing is characterized by</w:t>
-            </w:r>
-          </w:p>
-          <w:p>
-            <w:r>
-              <w:t>a)</w:t>
-            </w:r>
-            <w:r>
-              <w:t xml:space="preserve"> clarity, focus, and control.</w:t>
-            </w:r>
-          </w:p>
-          <w:p>
-            <w:r>
-              <w:t>b)</w:t>
-            </w:r>
-            <w:r>
-              <w:t xml:space="preserve"> main idea(s) that stand out.</w:t>
-            </w:r>
-          </w:p>
-          <w:p>
-            <w:r>
-              <w:t>c)</w:t>
-            </w:r>
-            <w:r>
-              <w:t xml:space="preserve"> supporting, relevant, carefully selected details</w:t>
-            </w:r>
-            <w:r>
-              <w:t>,</w:t>
-            </w:r>
-            <w:r>
-              <w:t xml:space="preserve"> when appropriate, use of</w:t>
-            </w:r>
-          </w:p>
-          <w:p>
-            <w:r>
-              <w:t>resources provides strong, accurate, credible support.</w:t>
-            </w:r>
-          </w:p>
-          <w:p>
-            <w:r>
-              <w:t>d)</w:t>
-            </w:r>
-            <w:r>
-              <w:t xml:space="preserve"> a thorough, balanced, in-depth explanation </w:t>
-            </w:r>
-            <w:r>
-              <w:t>or</w:t>
-            </w:r>
-            <w:r>
-              <w:t xml:space="preserve"> exploration of the topic</w:t>
-            </w:r>
-            <w:r>
-              <w:t>,</w:t>
-            </w:r>
-            <w:r>
-              <w:t xml:space="preserve"> the writing</w:t>
-            </w:r>
-          </w:p>
-          <w:p>
-            <w:r>
-              <w:t>makes connections and shares insights.</w:t>
-            </w:r>
-          </w:p>
-          <w:p>
-            <w:r>
-              <w:lastRenderedPageBreak/>
-              <w:t>e)</w:t>
-            </w:r>
-            <w:r>
-              <w:t xml:space="preserve"> content and selected details that are well-suited to audience and purpose.</w:t>
+              <w:t>are well-suited to audience and purpose.</w:t>
             </w:r>
           </w:p>
         </w:tc>
@@ -693,13 +751,15 @@
             <w:r>
               <w:t xml:space="preserve"> Since the dataset has the essays</w:t>
             </w:r>
-          </w:p>
-          <w:p>
+            <w:r>
+              <w:t xml:space="preserve"> </w:t>
+            </w:r>
             <w:r>
               <w:t>compressed into one line, please bear in mind that the paragraph information is lost. Hence,</w:t>
             </w:r>
-          </w:p>
-          <w:p>
+            <w:r>
+              <w:t xml:space="preserve"> </w:t>
+            </w:r>
             <w:r>
               <w:t>give writers the benefit of the doubt here.</w:t>
             </w:r>
@@ -733,8 +793,9 @@
             <w:r>
               <w:t>The essay shows some organization. Its form may not be that of a letter to the editor.</w:t>
             </w:r>
-          </w:p>
-          <w:p>
+            <w:r>
+              <w:t xml:space="preserve"> </w:t>
+            </w:r>
             <w:r>
               <w:t>Its ideas are not necessarily self-contained.</w:t>
             </w:r>
@@ -748,8 +809,9 @@
             <w:r>
               <w:t>The essay shows satisfactory organization. It contains a basic introduction, body and</w:t>
             </w:r>
-          </w:p>
-          <w:p>
+            <w:r>
+              <w:t xml:space="preserve"> </w:t>
+            </w:r>
             <w:r>
               <w:t>conclusion.</w:t>
             </w:r>
@@ -763,8 +825,9 @@
             <w:r>
               <w:t>The essay shows good organization. There is a flow of ideas. However, the ideas are</w:t>
             </w:r>
-          </w:p>
-          <w:p>
+            <w:r>
+              <w:t xml:space="preserve"> </w:t>
+            </w:r>
             <w:r>
               <w:t>mostly self-contained. The essay has the appropriate form as a letter to the editor.</w:t>
             </w:r>
@@ -778,13 +841,15 @@
             <w:r>
               <w:t>The essay is well-organized. There is a clear flow of ideas with each idea</w:t>
             </w:r>
-          </w:p>
-          <w:p>
+            <w:r>
+              <w:t xml:space="preserve"> </w:t>
+            </w:r>
             <w:r>
               <w:t>self-contained (this is where we assume that each idea is contained in a paragraph). The essay</w:t>
             </w:r>
-          </w:p>
-          <w:p>
+            <w:r>
+              <w:t xml:space="preserve"> </w:t>
+            </w:r>
             <w:r>
               <w:t>has the appropriate form as a letter to the editor.</w:t>
             </w:r>
@@ -821,40 +886,45 @@
           </w:tcPr>
           <w:p>
             <w:r>
-              <w:t xml:space="preserve">The writing shows an extremely limited vocabulary or is so </w:t>
+              <w:t>The writing shows an extremely limited vocabulary or is so filled with misuses of words</w:t>
+            </w:r>
+            <w:r>
+              <w:t xml:space="preserve"> </w:t>
+            </w:r>
+            <w:r>
+              <w:t xml:space="preserve">that the meaning is obscured. Only the most general kind of </w:t>
             </w:r>
             <w:r>
               <w:lastRenderedPageBreak/>
-              <w:t>filled with misuses of words</w:t>
-            </w:r>
-          </w:p>
-          <w:p>
-            <w:r>
-              <w:t>that the meaning is obscured. Only the most general kind of message is communicated</w:t>
-            </w:r>
-          </w:p>
-          <w:p>
+              <w:t>message is communicated</w:t>
+            </w:r>
+            <w:r>
+              <w:t xml:space="preserve"> </w:t>
+            </w:r>
             <w:r>
               <w:t>because of vague or imprecise language. The writing is characterized by</w:t>
             </w:r>
-          </w:p>
-          <w:p>
+            <w:r>
+              <w:t xml:space="preserve"> </w:t>
+            </w:r>
             <w:r>
               <w:t>a)</w:t>
             </w:r>
             <w:r>
               <w:t xml:space="preserve"> general, vague words that fail to communicate.</w:t>
             </w:r>
-          </w:p>
-          <w:p>
+            <w:r>
+              <w:t xml:space="preserve"> </w:t>
+            </w:r>
             <w:r>
               <w:t>b)</w:t>
             </w:r>
             <w:r>
               <w:t xml:space="preserve"> an extremely limited range of words.</w:t>
             </w:r>
-          </w:p>
-          <w:p>
+            <w:r>
+              <w:t xml:space="preserve"> </w:t>
+            </w:r>
             <w:r>
               <w:t>c)</w:t>
             </w:r>
@@ -867,8 +937,9 @@
             <w:r>
               <w:t xml:space="preserve"> they seem imprecise, inadequate, or just</w:t>
             </w:r>
-          </w:p>
-          <w:p>
+            <w:r>
+              <w:t xml:space="preserve"> </w:t>
+            </w:r>
             <w:r>
               <w:t>plain wrong.</w:t>
             </w:r>
@@ -887,43 +958,163 @@
               <w:t xml:space="preserve"> </w:t>
             </w:r>
             <w:r>
-              <w:t xml:space="preserve">or misused, detracting </w:t>
+              <w:t>or misused, detracting from the meaning and impact.</w:t>
+            </w:r>
+            <w:r>
+              <w:t xml:space="preserve"> </w:t>
+            </w:r>
+            <w:r>
+              <w:t>The writing is characterized by</w:t>
+            </w:r>
+            <w:r>
+              <w:t xml:space="preserve"> </w:t>
+            </w:r>
+            <w:r>
+              <w:t>a)</w:t>
+            </w:r>
+            <w:r>
+              <w:t xml:space="preserve"> words that are </w:t>
             </w:r>
             <w:r>
               <w:lastRenderedPageBreak/>
-              <w:t>from the meaning and impact.</w:t>
-            </w:r>
-          </w:p>
-          <w:p>
-            <w:r>
-              <w:t>The writing is characterized by</w:t>
-            </w:r>
-          </w:p>
-          <w:p>
+              <w:t>colourless</w:t>
+            </w:r>
+            <w:r>
+              <w:t>, flat or imprecise.</w:t>
+            </w:r>
+            <w:r>
+              <w:t xml:space="preserve"> </w:t>
+            </w:r>
+            <w:r>
+              <w:t>b)</w:t>
+            </w:r>
+            <w:r>
+              <w:t xml:space="preserve"> monotonous repetition or overwhelming reliance on worn expressions that</w:t>
+            </w:r>
+            <w:r>
+              <w:t xml:space="preserve"> </w:t>
+            </w:r>
+            <w:r>
+              <w:t>repeatedly detract from the message.</w:t>
+            </w:r>
+          </w:p>
+        </w:tc>
+        <w:tc>
+          <w:tcPr>
+            <w:tcW w:w="625" w:type="pct"/>
+          </w:tcPr>
+          <w:p>
+            <w:r>
+              <w:lastRenderedPageBreak/>
+              <w:t xml:space="preserve">Language lacks precision and </w:t>
+            </w:r>
+            <w:proofErr w:type="gramStart"/>
+            <w:r>
+              <w:t>variety, or</w:t>
+            </w:r>
+            <w:proofErr w:type="gramEnd"/>
+            <w:r>
+              <w:t xml:space="preserve"> may be inappropriate to audience and</w:t>
+            </w:r>
+            <w:r>
+              <w:t xml:space="preserve"> </w:t>
+            </w:r>
+            <w:r>
+              <w:t xml:space="preserve">purpose in places. The writer does not employ a variety of </w:t>
+            </w:r>
+            <w:r>
+              <w:lastRenderedPageBreak/>
+              <w:t>words, producing a sort of “generic”</w:t>
+            </w:r>
+            <w:r>
+              <w:t xml:space="preserve"> </w:t>
+            </w:r>
+            <w:r>
+              <w:t>paper filled with familiar words and phrases. The writing is characterized by</w:t>
+            </w:r>
+            <w:r>
+              <w:t xml:space="preserve"> </w:t>
+            </w:r>
             <w:r>
               <w:t>a)</w:t>
             </w:r>
             <w:r>
-              <w:t xml:space="preserve"> words that are </w:t>
-            </w:r>
-            <w:r>
-              <w:t>colourless</w:t>
-            </w:r>
-            <w:r>
-              <w:t>, flat or imprecise.</w:t>
-            </w:r>
-          </w:p>
-          <w:p>
+              <w:t xml:space="preserve"> words that work, but that rarely capture the reader’s interest.</w:t>
+            </w:r>
+            <w:r>
+              <w:t xml:space="preserve"> </w:t>
+            </w:r>
             <w:r>
               <w:t>b)</w:t>
             </w:r>
             <w:r>
-              <w:t xml:space="preserve"> monotonous repetition or overwhelming reliance on worn expressions that</w:t>
-            </w:r>
-          </w:p>
-          <w:p>
-            <w:r>
-              <w:t>repeatedly detract from the message.</w:t>
+              <w:t xml:space="preserve"> expression that seems mundane and general</w:t>
+            </w:r>
+            <w:r>
+              <w:t>,</w:t>
+            </w:r>
+            <w:r>
+              <w:t xml:space="preserve"> slang, if used, does not seem</w:t>
+            </w:r>
+            <w:r>
+              <w:t xml:space="preserve"> </w:t>
+            </w:r>
+            <w:r>
+              <w:t>purposeful and is not effective.</w:t>
+            </w:r>
+            <w:r>
+              <w:t xml:space="preserve"> </w:t>
+            </w:r>
+            <w:r>
+              <w:t>c)</w:t>
+            </w:r>
+            <w:r>
+              <w:t xml:space="preserve"> attempts at </w:t>
+            </w:r>
+            <w:r>
+              <w:t>colourful</w:t>
+            </w:r>
+            <w:r>
+              <w:t xml:space="preserve"> language that seem overdone or forced.</w:t>
+            </w:r>
+            <w:r>
+              <w:t xml:space="preserve"> </w:t>
+            </w:r>
+            <w:r>
+              <w:t>d)</w:t>
+            </w:r>
+            <w:r>
+              <w:t xml:space="preserve"> words that are accurate for the most part, although misused words may</w:t>
+            </w:r>
+            <w:r>
+              <w:t xml:space="preserve"> </w:t>
+            </w:r>
+            <w:r>
+              <w:t>occasionally appear</w:t>
+            </w:r>
+            <w:r>
+              <w:t>,</w:t>
+            </w:r>
+            <w:r>
+              <w:t xml:space="preserve"> technical language or jargon may be overused or inappropriately used.</w:t>
+            </w:r>
+            <w:r>
+              <w:t xml:space="preserve"> </w:t>
+            </w:r>
+            <w:r>
+              <w:t>e)</w:t>
+            </w:r>
+            <w:r>
+              <w:t xml:space="preserve"> reliance on clichés and overused expressions.</w:t>
+            </w:r>
+            <w:r>
+              <w:t xml:space="preserve"> </w:t>
+            </w:r>
+            <w:r>
+              <w:t>f)</w:t>
+            </w:r>
+            <w:r>
+              <w:t xml:space="preserve"> text that is too short to demonstrate variety.</w:t>
             </w:r>
           </w:p>
         </w:tc>
@@ -934,51 +1125,51 @@
           <w:p>
             <w:r>
               <w:lastRenderedPageBreak/>
-              <w:t xml:space="preserve">Language lacks precision and variety, or may be </w:t>
+              <w:t>Words effectively convey the intended message. The writer employs a variety of words</w:t>
+            </w:r>
+            <w:r>
+              <w:t xml:space="preserve"> </w:t>
+            </w:r>
+            <w:r>
+              <w:t xml:space="preserve">that are functional and appropriate to audience and </w:t>
             </w:r>
             <w:r>
               <w:lastRenderedPageBreak/>
-              <w:t>inappropriate to audience and</w:t>
-            </w:r>
-          </w:p>
-          <w:p>
-            <w:r>
-              <w:t>purpose in places. The writer does not employ a variety of words, producing a sort of “generic”</w:t>
-            </w:r>
-          </w:p>
-          <w:p>
-            <w:r>
-              <w:t>paper filled with familiar words and phrases. The writing is characterized by</w:t>
-            </w:r>
-          </w:p>
-          <w:p>
+              <w:t>purpose. The writing is characterized by</w:t>
+            </w:r>
+            <w:r>
+              <w:t xml:space="preserve"> </w:t>
+            </w:r>
             <w:r>
               <w:t>a)</w:t>
             </w:r>
             <w:r>
-              <w:t xml:space="preserve"> words that work, but that rarely capture the reader’s interest.</w:t>
-            </w:r>
-          </w:p>
-          <w:p>
+              <w:t xml:space="preserve"> words that work but do not particularly energize the writing.</w:t>
+            </w:r>
+            <w:r>
+              <w:t xml:space="preserve"> </w:t>
+            </w:r>
             <w:r>
               <w:t>b)</w:t>
             </w:r>
             <w:r>
-              <w:t xml:space="preserve"> expression that seems mundane and general</w:t>
+              <w:t xml:space="preserve"> expression that is functional</w:t>
             </w:r>
             <w:r>
               <w:t>,</w:t>
             </w:r>
             <w:r>
-              <w:t xml:space="preserve"> slang, if used, does not seem</w:t>
-            </w:r>
-          </w:p>
-          <w:p>
-            <w:r>
-              <w:t>purposeful and is not effective.</w:t>
-            </w:r>
-          </w:p>
-          <w:p>
+              <w:t xml:space="preserve"> however, slang, if used, does not seem purposeful</w:t>
+            </w:r>
+            <w:r>
+              <w:t xml:space="preserve"> </w:t>
+            </w:r>
+            <w:r>
+              <w:t>and is not particularly effective.</w:t>
+            </w:r>
+            <w:r>
+              <w:t xml:space="preserve"> </w:t>
+            </w:r>
             <w:r>
               <w:t>c)</w:t>
             </w:r>
@@ -989,297 +1180,218 @@
               <w:t>colourful</w:t>
             </w:r>
             <w:r>
-              <w:t xml:space="preserve"> language that seem overdone or forced.</w:t>
-            </w:r>
-          </w:p>
-          <w:p>
+              <w:t xml:space="preserve"> language that may occasionally seem overdone.</w:t>
+            </w:r>
+            <w:r>
+              <w:t xml:space="preserve"> </w:t>
+            </w:r>
             <w:r>
               <w:t>d)</w:t>
             </w:r>
             <w:r>
-              <w:t xml:space="preserve"> words that are accurate for the most part, although misused words may</w:t>
-            </w:r>
-          </w:p>
-          <w:p>
-            <w:r>
-              <w:t>occasionally appear</w:t>
+              <w:t xml:space="preserve"> occasional overuse of technical language or jargon.</w:t>
+            </w:r>
+            <w:r>
+              <w:t xml:space="preserve"> </w:t>
+            </w:r>
+            <w:r>
+              <w:t>e)</w:t>
+            </w:r>
+            <w:r>
+              <w:t xml:space="preserve"> rare experiments with language</w:t>
+            </w:r>
+            <w:r>
+              <w:t xml:space="preserve">, </w:t>
+            </w:r>
+            <w:r>
+              <w:t>however, the writing may have some fine</w:t>
+            </w:r>
+            <w:r>
+              <w:t xml:space="preserve"> </w:t>
+            </w:r>
+            <w:r>
+              <w:t>moments and generally avoids clichés.</w:t>
+            </w:r>
+          </w:p>
+        </w:tc>
+        <w:tc>
+          <w:tcPr>
+            <w:tcW w:w="625" w:type="pct"/>
+          </w:tcPr>
+          <w:p>
+            <w:r>
+              <w:lastRenderedPageBreak/>
+              <w:t>Words convey the intended message in an interesting, precise, and natural way</w:t>
+            </w:r>
+            <w:r>
+              <w:t xml:space="preserve"> </w:t>
+            </w:r>
+            <w:r>
+              <w:t xml:space="preserve">appropriate to audience and purpose. The writer employs a broad </w:t>
+            </w:r>
+            <w:r>
+              <w:lastRenderedPageBreak/>
+              <w:t>range of words which have</w:t>
+            </w:r>
+            <w:r>
+              <w:t xml:space="preserve"> </w:t>
+            </w:r>
+            <w:r>
+              <w:t>been carefully chosen and thoughtfully placed for impact. The writing is characterized by</w:t>
+            </w:r>
+            <w:r>
+              <w:t xml:space="preserve"> </w:t>
+            </w:r>
+            <w:r>
+              <w:t>a)</w:t>
+            </w:r>
+            <w:r>
+              <w:t xml:space="preserve"> accurate, specific words</w:t>
             </w:r>
             <w:r>
               <w:t>,</w:t>
             </w:r>
             <w:r>
-              <w:t xml:space="preserve"> technical language or jargon may be overused or inappropriately used.</w:t>
-            </w:r>
-          </w:p>
+              <w:t xml:space="preserve"> word choices energize the writing.</w:t>
+            </w:r>
+            <w:r>
+              <w:t xml:space="preserve"> </w:t>
+            </w:r>
+            <w:r>
+              <w:t>b)</w:t>
+            </w:r>
+            <w:r>
+              <w:t xml:space="preserve"> fresh, vivid expression</w:t>
+            </w:r>
+            <w:r>
+              <w:t>,</w:t>
+            </w:r>
+            <w:r>
+              <w:t xml:space="preserve"> slang, if used, seems purposeful and is effective.</w:t>
+            </w:r>
+            <w:r>
+              <w:t xml:space="preserve"> </w:t>
+            </w:r>
+            <w:r>
+              <w:t>c)</w:t>
+            </w:r>
+            <w:r>
+              <w:t xml:space="preserve"> vocabulary that may be striking and varied, but that is natural and not overdone.</w:t>
+            </w:r>
+            <w:r>
+              <w:t xml:space="preserve"> </w:t>
+            </w:r>
+            <w:r>
+              <w:t>d)</w:t>
+            </w:r>
+            <w:r>
+              <w:t xml:space="preserve"> ordinary words used in an unusual way.</w:t>
+            </w:r>
+            <w:r>
+              <w:t xml:space="preserve"> </w:t>
+            </w:r>
+            <w:r>
+              <w:t>e)</w:t>
+            </w:r>
+            <w:r>
+              <w:t xml:space="preserve"> words that evoke clear </w:t>
+            </w:r>
+            <w:r>
+              <w:t>images</w:t>
+            </w:r>
+            <w:r>
+              <w:t xml:space="preserve">, </w:t>
+            </w:r>
+            <w:r>
+              <w:t>figurative</w:t>
+            </w:r>
+            <w:r>
+              <w:t xml:space="preserve"> language may be used.</w:t>
+            </w:r>
+          </w:p>
+        </w:tc>
+        <w:tc>
+          <w:tcPr>
+            <w:tcW w:w="625" w:type="pct"/>
+          </w:tcPr>
           <w:p>
             <w:r>
               <w:lastRenderedPageBreak/>
-              <w:t>e)</w:t>
-            </w:r>
-            <w:r>
-              <w:t xml:space="preserve"> reliance on clichés and overused expressions.</w:t>
-            </w:r>
-          </w:p>
-          <w:p>
-            <w:r>
-              <w:t>f)</w:t>
-            </w:r>
-            <w:r>
-              <w:t xml:space="preserve"> text that is too short to demonstrate variety.</w:t>
-            </w:r>
-          </w:p>
-        </w:tc>
-        <w:tc>
-          <w:tcPr>
-            <w:tcW w:w="625" w:type="pct"/>
-          </w:tcPr>
-          <w:p>
+              <w:t>Words convey the intended message in an exceptionally interesting, precise, and</w:t>
+            </w:r>
+            <w:r>
+              <w:t xml:space="preserve"> </w:t>
+            </w:r>
+            <w:r>
+              <w:t xml:space="preserve">natural way appropriate to audience and purpose. The writer </w:t>
+            </w:r>
             <w:r>
               <w:lastRenderedPageBreak/>
-              <w:t xml:space="preserve">Words effectively convey the intended message. The writer </w:t>
-            </w:r>
-            <w:r>
-              <w:lastRenderedPageBreak/>
-              <w:t>employs a variety of words</w:t>
-            </w:r>
-          </w:p>
-          <w:p>
-            <w:r>
-              <w:t>that are functional and appropriate to audience and purpose. The writing is characterized by</w:t>
-            </w:r>
-          </w:p>
-          <w:p>
+              <w:t>employs a rich, broad range of</w:t>
+            </w:r>
+            <w:r>
+              <w:t xml:space="preserve"> </w:t>
+            </w:r>
+            <w:r>
+              <w:t>words which have been carefully chosen and thoughtfully placed for impact. The writing is</w:t>
+            </w:r>
+            <w:r>
+              <w:t xml:space="preserve"> </w:t>
+            </w:r>
+            <w:r>
+              <w:t>characterized by</w:t>
+            </w:r>
+            <w:r>
+              <w:t xml:space="preserve"> </w:t>
+            </w:r>
             <w:r>
               <w:t>a)</w:t>
             </w:r>
             <w:r>
-              <w:t xml:space="preserve"> words that work but do not particularly energize the writing.</w:t>
-            </w:r>
-          </w:p>
-          <w:p>
+              <w:t xml:space="preserve"> accurate, strong, specific words</w:t>
+            </w:r>
+            <w:r>
+              <w:t>,</w:t>
+            </w:r>
+            <w:r>
+              <w:t xml:space="preserve"> powerful words energize the writing.</w:t>
+            </w:r>
+            <w:r>
+              <w:t xml:space="preserve"> </w:t>
+            </w:r>
             <w:r>
               <w:t>b)</w:t>
             </w:r>
             <w:r>
-              <w:t xml:space="preserve"> expression that is functional</w:t>
+              <w:t xml:space="preserve"> fresh, original expression</w:t>
             </w:r>
             <w:r>
               <w:t>,</w:t>
             </w:r>
             <w:r>
-              <w:t xml:space="preserve"> however, slang, if used, does not seem purposeful</w:t>
-            </w:r>
-          </w:p>
-          <w:p>
-            <w:r>
-              <w:t>and is not particularly effective.</w:t>
-            </w:r>
-          </w:p>
-          <w:p>
+              <w:t xml:space="preserve"> slang, if used, seems purposeful and is effective.</w:t>
+            </w:r>
+            <w:r>
+              <w:t xml:space="preserve"> </w:t>
+            </w:r>
             <w:r>
               <w:t>c)</w:t>
             </w:r>
             <w:r>
-              <w:t xml:space="preserve"> attempts at </w:t>
-            </w:r>
-            <w:r>
-              <w:t>colourful</w:t>
-            </w:r>
-            <w:r>
-              <w:t xml:space="preserve"> language that may occasionally seem overdone.</w:t>
-            </w:r>
-          </w:p>
-          <w:p>
+              <w:t xml:space="preserve"> vocabulary that is striking and varied, but that is natural and not overdone.</w:t>
+            </w:r>
+            <w:r>
+              <w:t xml:space="preserve"> </w:t>
+            </w:r>
             <w:r>
               <w:t>d)</w:t>
             </w:r>
             <w:r>
-              <w:t xml:space="preserve"> occasional overuse of technical language or jargon.</w:t>
-            </w:r>
-          </w:p>
-          <w:p>
-            <w:r>
-              <w:t>e)</w:t>
-            </w:r>
-            <w:r>
-              <w:t xml:space="preserve"> rare experiments with language</w:t>
-            </w:r>
-            <w:r>
-              <w:t xml:space="preserve">, </w:t>
-            </w:r>
-            <w:r>
-              <w:t>however, the writing may have some fine</w:t>
-            </w:r>
-          </w:p>
-          <w:p>
-            <w:r>
-              <w:t>moments and generally avoids clichés.</w:t>
-            </w:r>
-          </w:p>
-        </w:tc>
-        <w:tc>
-          <w:tcPr>
-            <w:tcW w:w="625" w:type="pct"/>
-          </w:tcPr>
-          <w:p>
-            <w:r>
-              <w:lastRenderedPageBreak/>
-              <w:t xml:space="preserve">Words convey the intended message in an interesting, </w:t>
-            </w:r>
-            <w:r>
-              <w:lastRenderedPageBreak/>
-              <w:t>precise, and natural way</w:t>
-            </w:r>
-          </w:p>
-          <w:p>
-            <w:r>
-              <w:t>appropriate to audience and purpose. The writer employs a broad range of words which have</w:t>
-            </w:r>
-          </w:p>
-          <w:p>
-            <w:r>
-              <w:t>been carefully chosen and thoughtfully placed for impact. The writing is characterized by</w:t>
-            </w:r>
-          </w:p>
-          <w:p>
-            <w:r>
-              <w:t>a)</w:t>
-            </w:r>
-            <w:r>
-              <w:t xml:space="preserve"> accurate, specific words</w:t>
-            </w:r>
-            <w:r>
-              <w:t>,</w:t>
-            </w:r>
-            <w:r>
-              <w:t xml:space="preserve"> word choices energize the writing.</w:t>
-            </w:r>
-          </w:p>
-          <w:p>
-            <w:r>
-              <w:t>b)</w:t>
-            </w:r>
-            <w:r>
-              <w:t xml:space="preserve"> fresh, vivid expression</w:t>
-            </w:r>
-            <w:r>
-              <w:t>,</w:t>
-            </w:r>
-            <w:r>
-              <w:t xml:space="preserve"> slang, if used, seems purposeful and is effective.</w:t>
-            </w:r>
-          </w:p>
-          <w:p>
-            <w:r>
-              <w:t>c)</w:t>
-            </w:r>
-            <w:r>
-              <w:t xml:space="preserve"> vocabulary that may be striking and varied, but that is natural and not overdone.</w:t>
-            </w:r>
-          </w:p>
-          <w:p>
-            <w:r>
-              <w:t>d)</w:t>
-            </w:r>
-            <w:r>
               <w:t xml:space="preserve"> ordinary words used in an unusual way.</w:t>
             </w:r>
-          </w:p>
-          <w:p>
-            <w:r>
-              <w:t>e)</w:t>
-            </w:r>
-            <w:r>
-              <w:t xml:space="preserve"> words that evoke clear </w:t>
-            </w:r>
-            <w:r>
-              <w:t>images</w:t>
-            </w:r>
-            <w:r>
-              <w:t xml:space="preserve">, </w:t>
-            </w:r>
-            <w:r>
-              <w:t>figurative</w:t>
-            </w:r>
-            <w:r>
-              <w:t xml:space="preserve"> language may be used.</w:t>
-            </w:r>
-          </w:p>
-        </w:tc>
-        <w:tc>
-          <w:tcPr>
-            <w:tcW w:w="625" w:type="pct"/>
-          </w:tcPr>
-          <w:p>
-            <w:r>
-              <w:lastRenderedPageBreak/>
-              <w:t xml:space="preserve">Words convey the intended message in an exceptionally </w:t>
-            </w:r>
-            <w:r>
-              <w:lastRenderedPageBreak/>
-              <w:t>interesting, precise, and</w:t>
-            </w:r>
-          </w:p>
-          <w:p>
-            <w:r>
-              <w:t>natural way appropriate to audience and purpose. The writer employs a rich, broad range of</w:t>
-            </w:r>
-          </w:p>
-          <w:p>
-            <w:r>
-              <w:t>words which have been carefully chosen and thoughtfully placed for impact. The writing is</w:t>
-            </w:r>
-          </w:p>
-          <w:p>
-            <w:r>
-              <w:t>characterized by</w:t>
-            </w:r>
-          </w:p>
-          <w:p>
-            <w:r>
-              <w:t>a)</w:t>
-            </w:r>
-            <w:r>
-              <w:t xml:space="preserve"> accurate, strong, specific words</w:t>
-            </w:r>
-            <w:r>
-              <w:t>,</w:t>
-            </w:r>
-            <w:r>
-              <w:t xml:space="preserve"> powerful words energize the writing.</w:t>
-            </w:r>
-          </w:p>
-          <w:p>
-            <w:r>
-              <w:t>b)</w:t>
-            </w:r>
-            <w:r>
-              <w:t xml:space="preserve"> fresh, original expression</w:t>
-            </w:r>
-            <w:r>
-              <w:t>,</w:t>
-            </w:r>
-            <w:r>
-              <w:t xml:space="preserve"> slang, if used, seems purposeful and is effective.</w:t>
-            </w:r>
-          </w:p>
-          <w:p>
-            <w:r>
-              <w:t>c)</w:t>
-            </w:r>
-            <w:r>
-              <w:t xml:space="preserve"> vocabulary that is striking and varied, but that is natural and not overdone.</w:t>
-            </w:r>
-          </w:p>
-          <w:p>
-            <w:r>
-              <w:t>d)</w:t>
-            </w:r>
-            <w:r>
-              <w:t xml:space="preserve"> ordinary words used in an unusual way.</w:t>
-            </w:r>
-          </w:p>
-          <w:p>
+            <w:r>
+              <w:t xml:space="preserve"> </w:t>
+            </w:r>
             <w:r>
               <w:t>e)</w:t>
             </w:r>
@@ -1328,37 +1440,42 @@
             <w:r>
               <w:t>The writing is difficult to follow or to read aloud. Sentences tend to be incomplete,</w:t>
             </w:r>
-          </w:p>
-          <w:p>
+            <w:r>
+              <w:t xml:space="preserve"> </w:t>
+            </w:r>
             <w:r>
               <w:t>rambling, or very awkward. The writing is characterized by</w:t>
             </w:r>
-          </w:p>
-          <w:p>
+            <w:r>
+              <w:t xml:space="preserve"> </w:t>
+            </w:r>
             <w:r>
               <w:t>a)</w:t>
             </w:r>
             <w:r>
               <w:t xml:space="preserve"> text that does not invite—and may not even permit—smooth oral reading.</w:t>
             </w:r>
-          </w:p>
-          <w:p>
+            <w:r>
+              <w:t xml:space="preserve"> </w:t>
+            </w:r>
             <w:r>
               <w:t>b)</w:t>
             </w:r>
             <w:r>
               <w:t xml:space="preserve"> confusing word order that is often jarring and irregular.</w:t>
             </w:r>
-          </w:p>
-          <w:p>
+            <w:r>
+              <w:t xml:space="preserve"> </w:t>
+            </w:r>
             <w:r>
               <w:t>c)</w:t>
             </w:r>
             <w:r>
               <w:t xml:space="preserve"> sentence structure that frequently obscures meaning.</w:t>
             </w:r>
-          </w:p>
-          <w:p>
+            <w:r>
+              <w:t xml:space="preserve"> </w:t>
+            </w:r>
             <w:r>
               <w:t>d)</w:t>
             </w:r>
@@ -1375,34 +1492,39 @@
             <w:r>
               <w:t>The writing tends to be either choppy or rambling. Awkward constructions often force</w:t>
             </w:r>
-          </w:p>
-          <w:p>
+            <w:r>
+              <w:t xml:space="preserve"> </w:t>
+            </w:r>
             <w:r>
               <w:t>the reader to slow down or reread. The writing is characterized by</w:t>
             </w:r>
-          </w:p>
-          <w:p>
+            <w:r>
+              <w:t xml:space="preserve"> </w:t>
+            </w:r>
             <w:r>
               <w:t>a)</w:t>
             </w:r>
             <w:r>
               <w:t xml:space="preserve"> significant portions of the text that are difficult to follow or read aloud.</w:t>
             </w:r>
-          </w:p>
-          <w:p>
+            <w:r>
+              <w:t xml:space="preserve"> </w:t>
+            </w:r>
             <w:r>
               <w:t>b)</w:t>
             </w:r>
             <w:r>
               <w:t xml:space="preserve"> sentence patterns that are monotonous (e.g., subject-verb or</w:t>
             </w:r>
-          </w:p>
-          <w:p>
+            <w:r>
+              <w:t xml:space="preserve"> </w:t>
+            </w:r>
             <w:r>
               <w:t>subject-verb-object).</w:t>
             </w:r>
-          </w:p>
-          <w:p>
+            <w:r>
+              <w:t xml:space="preserve"> </w:t>
+            </w:r>
             <w:r>
               <w:t>c)</w:t>
             </w:r>
@@ -1419,13 +1541,15 @@
             <w:r>
               <w:t>The writing tends to be mechanical rather than fluid. Occasional awkward</w:t>
             </w:r>
-          </w:p>
-          <w:p>
+            <w:r>
+              <w:t xml:space="preserve"> </w:t>
+            </w:r>
             <w:r>
               <w:t>constructions may force the reader to slow down or reread. The writing is characterized by</w:t>
             </w:r>
-          </w:p>
-          <w:p>
+            <w:r>
+              <w:t xml:space="preserve"> </w:t>
+            </w:r>
             <w:r>
               <w:t>a)</w:t>
             </w:r>
@@ -1444,8 +1568,9 @@
             <w:r>
               <w:t>, others do not.</w:t>
             </w:r>
-          </w:p>
-          <w:p>
+            <w:r>
+              <w:t xml:space="preserve"> </w:t>
+            </w:r>
             <w:r>
               <w:t>b)</w:t>
             </w:r>
@@ -1458,13 +1583,15 @@
             <w:r>
               <w:t>although the writer</w:t>
             </w:r>
-          </w:p>
-          <w:p>
+            <w:r>
+              <w:t xml:space="preserve"> </w:t>
+            </w:r>
             <w:r>
               <w:t>falls into repetitive sentence patterns.</w:t>
             </w:r>
-          </w:p>
-          <w:p>
+            <w:r>
+              <w:t xml:space="preserve"> </w:t>
+            </w:r>
             <w:r>
               <w:t>c)</w:t>
             </w:r>
@@ -1489,32 +1616,35 @@
             <w:r>
               <w:t>present, may not be effective.</w:t>
             </w:r>
-          </w:p>
-          <w:p>
+            <w:r>
+              <w:t xml:space="preserve"> </w:t>
+            </w:r>
+            <w:r>
+              <w:t>d)</w:t>
+            </w:r>
+            <w:r>
+              <w:t xml:space="preserve"> sentences which, although functional, lack energy.</w:t>
+            </w:r>
+            <w:r>
+              <w:t xml:space="preserve"> </w:t>
+            </w:r>
+            <w:r>
+              <w:t>e)</w:t>
+            </w:r>
+            <w:r>
+              <w:t xml:space="preserve"> lapses in stylistic control</w:t>
+            </w:r>
+            <w:r>
+              <w:t>,</w:t>
+            </w:r>
+            <w:r>
+              <w:t xml:space="preserve"> dialogue, if used, may sound stilted or unnatural.</w:t>
+            </w:r>
+            <w:r>
+              <w:t xml:space="preserve"> </w:t>
+            </w:r>
             <w:r>
               <w:lastRenderedPageBreak/>
-              <w:t>d)</w:t>
-            </w:r>
-            <w:r>
-              <w:t xml:space="preserve"> sentences which, although functional, lack energy.</w:t>
-            </w:r>
-          </w:p>
-          <w:p>
-            <w:r>
-              <w:t>e)</w:t>
-            </w:r>
-            <w:r>
-              <w:t xml:space="preserve"> lapses in stylistic control</w:t>
-            </w:r>
-            <w:r>
-              <w:t>,</w:t>
-            </w:r>
-            <w:r>
-              <w:t xml:space="preserve"> dialogue, if used, may sound stilted or unnatural.</w:t>
-            </w:r>
-          </w:p>
-          <w:p>
-            <w:r>
               <w:t>f)</w:t>
             </w:r>
             <w:r>
@@ -1549,8 +1679,9 @@
             <w:r>
               <w:t>than fluid. Sentence patterns are somewhat varied, contributing to ease in oral reading. The</w:t>
             </w:r>
-          </w:p>
-          <w:p>
+            <w:r>
+              <w:t xml:space="preserve"> </w:t>
+            </w:r>
             <w:r>
               <w:t>writing is</w:t>
             </w:r>
@@ -1560,8 +1691,9 @@
             <w:r>
               <w:t>characterized by</w:t>
             </w:r>
-          </w:p>
-          <w:p>
+            <w:r>
+              <w:t xml:space="preserve"> </w:t>
+            </w:r>
             <w:r>
               <w:t>a)</w:t>
             </w:r>
@@ -1574,55 +1706,60 @@
             <w:r>
               <w:t xml:space="preserve"> the reader can move easily through the piece, although it may</w:t>
             </w:r>
-          </w:p>
-          <w:p>
+            <w:r>
+              <w:t xml:space="preserve"> </w:t>
+            </w:r>
             <w:r>
               <w:t>lack a certain rhythm and grace.</w:t>
             </w:r>
-          </w:p>
-          <w:p>
+            <w:r>
+              <w:t xml:space="preserve"> </w:t>
+            </w:r>
             <w:r>
               <w:t>b)</w:t>
             </w:r>
             <w:r>
               <w:t xml:space="preserve"> some repeated patterns of sentence structure, length, and beginnings that may</w:t>
             </w:r>
-          </w:p>
-          <w:p>
+            <w:r>
+              <w:t xml:space="preserve"> </w:t>
+            </w:r>
             <w:r>
               <w:t>detract somewhat from overall impact.</w:t>
             </w:r>
-          </w:p>
-          <w:p>
+            <w:r>
+              <w:t xml:space="preserve"> </w:t>
+            </w:r>
             <w:r>
               <w:t xml:space="preserve">c) </w:t>
             </w:r>
             <w:r>
-              <w:t xml:space="preserve">strong control over simple </w:t>
+              <w:t>strong control over simple sentence structures, but variable control over more</w:t>
+            </w:r>
+            <w:r>
+              <w:t xml:space="preserve"> </w:t>
+            </w:r>
+            <w:r>
+              <w:t>complex sentences</w:t>
+            </w:r>
+            <w:r>
+              <w:t xml:space="preserve">, </w:t>
+            </w:r>
+            <w:r>
+              <w:t>fragments, if present, are usually effective.</w:t>
+            </w:r>
+            <w:r>
+              <w:t xml:space="preserve"> </w:t>
+            </w:r>
+            <w:r>
+              <w:t>d)</w:t>
+            </w:r>
+            <w:r>
+              <w:t xml:space="preserve"> occasional lapses in </w:t>
             </w:r>
             <w:r>
               <w:lastRenderedPageBreak/>
-              <w:t>sentence structures, but variable control over more</w:t>
-            </w:r>
-            <w:r>
-              <w:t xml:space="preserve"> </w:t>
-            </w:r>
-            <w:r>
-              <w:t>complex sentences</w:t>
-            </w:r>
-            <w:r>
-              <w:t xml:space="preserve">, </w:t>
-            </w:r>
-            <w:r>
-              <w:t>fragments, if present, are usually effective.</w:t>
-            </w:r>
-          </w:p>
-          <w:p>
-            <w:r>
-              <w:t>d)</w:t>
-            </w:r>
-            <w:r>
-              <w:t xml:space="preserve"> occasional lapses in stylistic control</w:t>
+              <w:t>stylistic control</w:t>
             </w:r>
             <w:r>
               <w:t>,</w:t>
@@ -1653,18 +1790,21 @@
               <w:lastRenderedPageBreak/>
               <w:t>The writing has an easy flow and rhythm. Sentences are carefully crafted, with strong</w:t>
             </w:r>
-          </w:p>
-          <w:p>
+            <w:r>
+              <w:t xml:space="preserve"> </w:t>
+            </w:r>
             <w:r>
               <w:t>and varied structure that makes expressive oral reading easy and enjoyable. The writing is</w:t>
             </w:r>
-          </w:p>
-          <w:p>
+            <w:r>
+              <w:t xml:space="preserve"> </w:t>
+            </w:r>
             <w:r>
               <w:t>characterized by</w:t>
             </w:r>
-          </w:p>
-          <w:p>
+            <w:r>
+              <w:t xml:space="preserve"> </w:t>
+            </w:r>
             <w:r>
               <w:t>a)</w:t>
             </w:r>
@@ -1677,8 +1817,9 @@
             <w:r>
               <w:t xml:space="preserve"> it glides along with one sentence flowing into the next.</w:t>
             </w:r>
-          </w:p>
-          <w:p>
+            <w:r>
+              <w:t xml:space="preserve"> </w:t>
+            </w:r>
             <w:r>
               <w:t>b)</w:t>
             </w:r>
@@ -1691,16 +1832,18 @@
             <w:r>
               <w:t>text.</w:t>
             </w:r>
-          </w:p>
-          <w:p>
+            <w:r>
+              <w:t xml:space="preserve"> </w:t>
+            </w:r>
             <w:r>
               <w:t>c)</w:t>
             </w:r>
             <w:r>
               <w:t xml:space="preserve"> sentence structure that enhances meaning.</w:t>
             </w:r>
-          </w:p>
-          <w:p>
+            <w:r>
+              <w:t xml:space="preserve"> </w:t>
+            </w:r>
             <w:r>
               <w:t>d)</w:t>
             </w:r>
@@ -1713,122 +1856,131 @@
             <w:r>
               <w:t xml:space="preserve"> fragments, if used at all, work well.</w:t>
             </w:r>
-          </w:p>
-          <w:p>
+            <w:r>
+              <w:t xml:space="preserve"> </w:t>
+            </w:r>
+            <w:r>
+              <w:t>e)</w:t>
+            </w:r>
+            <w:r>
+              <w:t xml:space="preserve"> stylistic control</w:t>
+            </w:r>
+            <w:r>
+              <w:t>,</w:t>
+            </w:r>
+            <w:r>
+              <w:t xml:space="preserve"> dialogue, if used, sounds natural.</w:t>
+            </w:r>
+          </w:p>
+        </w:tc>
+        <w:tc>
+          <w:tcPr>
+            <w:tcW w:w="625" w:type="pct"/>
+          </w:tcPr>
+          <w:p>
+            <w:r>
+              <w:t>The writing has an effective flow and rhythm. Sentences show a high degree of</w:t>
+            </w:r>
+            <w:r>
+              <w:t xml:space="preserve"> </w:t>
+            </w:r>
+            <w:r>
+              <w:t>craftsmanship, with consistently strong and varied structure that makes expressive oral reading</w:t>
+            </w:r>
+            <w:r>
+              <w:t xml:space="preserve"> </w:t>
+            </w:r>
+            <w:r>
+              <w:t>easy and enjoyable. The writing is characterized by</w:t>
+            </w:r>
+            <w:r>
+              <w:t xml:space="preserve"> </w:t>
+            </w:r>
+            <w:r>
+              <w:t>a)</w:t>
+            </w:r>
+            <w:r>
+              <w:t xml:space="preserve"> a natural, fluent sound</w:t>
+            </w:r>
+            <w:r>
+              <w:t>,</w:t>
+            </w:r>
+            <w:r>
+              <w:t xml:space="preserve"> it glides along with one sentence flowing effortlessly into</w:t>
+            </w:r>
+            <w:r>
+              <w:t xml:space="preserve"> </w:t>
+            </w:r>
+            <w:r>
+              <w:t>the next.</w:t>
+            </w:r>
+            <w:r>
+              <w:t xml:space="preserve"> </w:t>
+            </w:r>
+            <w:r>
+              <w:t>b)</w:t>
+            </w:r>
+            <w:r>
+              <w:t xml:space="preserve"> extensive variation in sentence structure, length, and beginnings that add interest</w:t>
+            </w:r>
+            <w:r>
+              <w:t xml:space="preserve"> </w:t>
+            </w:r>
+            <w:r>
+              <w:t>to the text.</w:t>
+            </w:r>
+            <w:r>
+              <w:t xml:space="preserve"> </w:t>
+            </w:r>
+            <w:r>
+              <w:t>c)</w:t>
+            </w:r>
+            <w:r>
+              <w:t xml:space="preserve"> sentence structure that enhances meaning by drawing attention to key ideas or</w:t>
+            </w:r>
+            <w:r>
+              <w:t xml:space="preserve"> </w:t>
+            </w:r>
+            <w:r>
+              <w:t>reinforcing relationships among ideas.</w:t>
+            </w:r>
+            <w:r>
+              <w:t xml:space="preserve"> </w:t>
+            </w:r>
+            <w:r>
+              <w:t>d)</w:t>
+            </w:r>
+            <w:r>
+              <w:t xml:space="preserve"> varied sentence patterns that create an effective combination of </w:t>
+            </w:r>
             <w:r>
               <w:lastRenderedPageBreak/>
+              <w:t>power and</w:t>
+            </w:r>
+            <w:r>
+              <w:t xml:space="preserve"> </w:t>
+            </w:r>
+            <w:r>
+              <w:t>grace.</w:t>
+            </w:r>
+            <w:r>
+              <w:t xml:space="preserve"> </w:t>
+            </w:r>
+            <w:r>
               <w:t>e)</w:t>
             </w:r>
             <w:r>
-              <w:t xml:space="preserve"> stylistic control</w:t>
+              <w:t xml:space="preserve"> strong control over sentence structure</w:t>
             </w:r>
             <w:r>
               <w:t>,</w:t>
             </w:r>
             <w:r>
-              <w:t xml:space="preserve"> dialogue, if used, sounds natural.</w:t>
-            </w:r>
-          </w:p>
-        </w:tc>
-        <w:tc>
-          <w:tcPr>
-            <w:tcW w:w="625" w:type="pct"/>
-          </w:tcPr>
-          <w:p>
-            <w:r>
-              <w:lastRenderedPageBreak/>
-              <w:t>The writing has an effective flow and rhythm. Sentences show a high degree of</w:t>
-            </w:r>
-            <w:r>
-              <w:t xml:space="preserve"> </w:t>
-            </w:r>
-            <w:r>
-              <w:t>craftsmanship, with consistently strong and varied structure that makes expressive oral reading</w:t>
-            </w:r>
-          </w:p>
-          <w:p>
-            <w:r>
-              <w:t>easy and enjoyable. The writing is characterized by</w:t>
-            </w:r>
-          </w:p>
-          <w:p>
-            <w:r>
-              <w:t>a)</w:t>
-            </w:r>
-            <w:r>
-              <w:t xml:space="preserve"> a natural, fluent sound</w:t>
-            </w:r>
-            <w:r>
-              <w:t>,</w:t>
-            </w:r>
-            <w:r>
-              <w:t xml:space="preserve"> it glides along with one sentence flowing effortlessly into</w:t>
-            </w:r>
-          </w:p>
-          <w:p>
-            <w:r>
-              <w:t>the next.</w:t>
-            </w:r>
-          </w:p>
-          <w:p>
-            <w:r>
-              <w:t>b)</w:t>
-            </w:r>
-            <w:r>
-              <w:t xml:space="preserve"> extensive variation in sentence structure, length, and beginnings that add interest</w:t>
-            </w:r>
-            <w:r>
-              <w:t xml:space="preserve"> </w:t>
-            </w:r>
-            <w:r>
-              <w:t>to the text.</w:t>
-            </w:r>
-          </w:p>
-          <w:p>
-            <w:r>
-              <w:t>c)</w:t>
-            </w:r>
-            <w:r>
-              <w:t xml:space="preserve"> sentence structure that enhances meaning </w:t>
-            </w:r>
-            <w:r>
-              <w:lastRenderedPageBreak/>
-              <w:t>by drawing attention to key ideas or</w:t>
-            </w:r>
-          </w:p>
-          <w:p>
-            <w:r>
-              <w:t>reinforcing relationships among ideas.</w:t>
-            </w:r>
-          </w:p>
-          <w:p>
-            <w:r>
-              <w:t>d)</w:t>
-            </w:r>
-            <w:r>
-              <w:t xml:space="preserve"> varied sentence patterns that create an effective combination of power and</w:t>
-            </w:r>
-          </w:p>
-          <w:p>
-            <w:r>
-              <w:t>grace.</w:t>
-            </w:r>
-          </w:p>
-          <w:p>
-            <w:r>
-              <w:t>e)</w:t>
-            </w:r>
-            <w:r>
-              <w:t xml:space="preserve"> strong control over sentence structure</w:t>
-            </w:r>
-            <w:r>
-              <w:t>,</w:t>
-            </w:r>
-            <w:r>
               <w:t xml:space="preserve"> fragments, if used at all, work well.</w:t>
             </w:r>
-          </w:p>
-          <w:p>
+            <w:r>
+              <w:t xml:space="preserve"> </w:t>
+            </w:r>
             <w:r>
               <w:t>f)</w:t>
             </w:r>
@@ -1885,8 +2037,9 @@
             <w:r>
               <w:t>Numerous errors in usage, spelling, capitalization, and punctuation repeatedly distract</w:t>
             </w:r>
-          </w:p>
-          <w:p>
+            <w:r>
+              <w:t xml:space="preserve"> </w:t>
+            </w:r>
             <w:r>
               <w:t>the reader and make the text difficult to read. In fact, the severity and frequency of errors are so</w:t>
             </w:r>
@@ -1896,51 +2049,61 @@
             <w:r>
               <w:t>overwhelming that the reader finds it difficult to focus on the message and must reread for</w:t>
             </w:r>
-          </w:p>
-          <w:p>
+            <w:r>
+              <w:t xml:space="preserve"> </w:t>
+            </w:r>
+            <w:r>
+              <w:t>meaning. The writing is characterized by</w:t>
+            </w:r>
+            <w:r>
+              <w:t xml:space="preserve"> </w:t>
+            </w:r>
+            <w:r>
+              <w:t>a)</w:t>
+            </w:r>
+            <w:r>
+              <w:t xml:space="preserve"> very limited skill in using conventions.</w:t>
+            </w:r>
+            <w:r>
+              <w:t xml:space="preserve"> </w:t>
+            </w:r>
+            <w:r>
+              <w:t>b)</w:t>
+            </w:r>
+            <w:r>
+              <w:t xml:space="preserve"> basic punctuation (including end-of-sentence punctuation) that tends to be</w:t>
+            </w:r>
+            <w:r>
+              <w:t xml:space="preserve"> </w:t>
+            </w:r>
+            <w:r>
+              <w:t xml:space="preserve">omitted, haphazard, or </w:t>
+            </w:r>
             <w:r>
               <w:lastRenderedPageBreak/>
-              <w:t>meaning. The writing is characterized by</w:t>
-            </w:r>
-          </w:p>
-          <w:p>
-            <w:r>
-              <w:t>a)</w:t>
-            </w:r>
-            <w:r>
-              <w:t xml:space="preserve"> very limited skill in using conventions.</w:t>
-            </w:r>
-          </w:p>
-          <w:p>
-            <w:r>
-              <w:t>b)</w:t>
-            </w:r>
-            <w:r>
-              <w:t xml:space="preserve"> basic punctuation (including end-of-sentence punctuation) that tends to be</w:t>
-            </w:r>
-          </w:p>
-          <w:p>
-            <w:r>
-              <w:t>omitted, haphazard, or incorrect.</w:t>
-            </w:r>
-          </w:p>
-          <w:p>
+              <w:t>incorrect.</w:t>
+            </w:r>
+            <w:r>
+              <w:t xml:space="preserve"> </w:t>
+            </w:r>
             <w:r>
               <w:t>c)</w:t>
             </w:r>
             <w:r>
               <w:t xml:space="preserve"> frequent spelling errors that significantly impair readability.</w:t>
             </w:r>
-          </w:p>
-          <w:p>
+            <w:r>
+              <w:t xml:space="preserve"> </w:t>
+            </w:r>
             <w:r>
               <w:t>d)</w:t>
             </w:r>
             <w:r>
               <w:t xml:space="preserve"> capitalization that appears to be random.</w:t>
             </w:r>
-          </w:p>
-          <w:p>
+            <w:r>
+              <w:t xml:space="preserve"> </w:t>
+            </w:r>
             <w:r>
               <w:t>e)</w:t>
             </w:r>
@@ -1958,21 +2121,24 @@
               <w:lastRenderedPageBreak/>
               <w:t>The writing demonstrates little control of standard writing conventions. Frequent,</w:t>
             </w:r>
-          </w:p>
-          <w:p>
+            <w:r>
+              <w:t xml:space="preserve"> </w:t>
+            </w:r>
             <w:r>
               <w:t>significant errors impede readability. The writing is characterized by</w:t>
             </w:r>
-          </w:p>
-          <w:p>
+            <w:r>
+              <w:t xml:space="preserve"> </w:t>
+            </w:r>
             <w:r>
               <w:t>a)</w:t>
             </w:r>
             <w:r>
               <w:t xml:space="preserve"> little control over basic conventions.</w:t>
             </w:r>
-          </w:p>
-          <w:p>
+            <w:r>
+              <w:t xml:space="preserve"> </w:t>
+            </w:r>
             <w:r>
               <w:t>b)</w:t>
             </w:r>
@@ -1985,49 +2151,58 @@
             <w:r>
               <w:t xml:space="preserve"> internal punctuation contains frequent</w:t>
             </w:r>
-          </w:p>
-          <w:p>
+            <w:r>
+              <w:t xml:space="preserve"> </w:t>
+            </w:r>
             <w:r>
               <w:t>errors.</w:t>
             </w:r>
-          </w:p>
-          <w:p>
+            <w:r>
+              <w:t xml:space="preserve"> </w:t>
+            </w:r>
+            <w:r>
+              <w:t xml:space="preserve">c) </w:t>
+            </w:r>
+            <w:r>
+              <w:t>spelling errors that frequently distract the reader</w:t>
+            </w:r>
+            <w:r>
+              <w:t>,</w:t>
+            </w:r>
+            <w:r>
+              <w:t xml:space="preserve"> misspelling of common words</w:t>
+            </w:r>
+            <w:r>
+              <w:t xml:space="preserve"> </w:t>
+            </w:r>
+            <w:r>
+              <w:t>often occurs.</w:t>
+            </w:r>
+            <w:r>
+              <w:t xml:space="preserve"> </w:t>
+            </w:r>
+            <w:r>
+              <w:t>d)</w:t>
+            </w:r>
+            <w:r>
+              <w:t>capitalization that is inconsistent or often incorrect.</w:t>
+            </w:r>
+            <w:r>
+              <w:t xml:space="preserve"> </w:t>
+            </w:r>
+            <w:r>
+              <w:t xml:space="preserve">e) </w:t>
+            </w:r>
+            <w:r>
+              <w:t xml:space="preserve">errors in grammar and usage that </w:t>
+            </w:r>
             <w:r>
               <w:lastRenderedPageBreak/>
-              <w:t xml:space="preserve">c) </w:t>
-            </w:r>
-            <w:r>
-              <w:t>spelling errors that frequently distract the reader</w:t>
-            </w:r>
-            <w:r>
-              <w:t>,</w:t>
-            </w:r>
-            <w:r>
-              <w:t xml:space="preserve"> misspelling of common words</w:t>
-            </w:r>
-          </w:p>
-          <w:p>
-            <w:r>
-              <w:t>often occurs.</w:t>
-            </w:r>
-          </w:p>
-          <w:p>
-            <w:r>
-              <w:t>d)</w:t>
-            </w:r>
-            <w:r>
-              <w:t>capitalization that is inconsistent or often incorrect.</w:t>
-            </w:r>
-          </w:p>
-          <w:p>
-            <w:r>
-              <w:t xml:space="preserve">e) </w:t>
-            </w:r>
-            <w:r>
-              <w:t>errors in grammar and usage that interfere with readability and meaning.</w:t>
-            </w:r>
-          </w:p>
-          <w:p>
+              <w:t>interfere with readability and meaning.</w:t>
+            </w:r>
+            <w:r>
+              <w:t xml:space="preserve"> </w:t>
+            </w:r>
             <w:r>
               <w:t xml:space="preserve">f) </w:t>
             </w:r>
@@ -2045,95 +2220,111 @@
               <w:lastRenderedPageBreak/>
               <w:t>The writing demonstrates limited control of standard writing conventions (e.g.,</w:t>
             </w:r>
-          </w:p>
-          <w:p>
+            <w:r>
+              <w:t xml:space="preserve"> </w:t>
+            </w:r>
             <w:r>
               <w:t>punctuation, spelling, capitalization, grammar and usage). Errors begin to impede readability.</w:t>
             </w:r>
-          </w:p>
-          <w:p>
+            <w:r>
+              <w:t xml:space="preserve"> </w:t>
+            </w:r>
             <w:r>
               <w:t>The writing is characterized by</w:t>
             </w:r>
-          </w:p>
-          <w:p>
+            <w:r>
+              <w:t xml:space="preserve"> </w:t>
+            </w:r>
             <w:r>
               <w:t>a)</w:t>
             </w:r>
             <w:r>
-              <w:t xml:space="preserve"> some control over basic conventions</w:t>
+              <w:t xml:space="preserve"> some control over basic </w:t>
+            </w:r>
+            <w:proofErr w:type="gramStart"/>
+            <w:r>
+              <w:t>conventions</w:t>
             </w:r>
             <w:r>
               <w:t>,</w:t>
             </w:r>
-            <w:r>
-              <w:t xml:space="preserve"> the text may be too </w:t>
+            <w:proofErr w:type="gramEnd"/>
+            <w:r>
+              <w:t xml:space="preserve"> the text may be too simple or too short to</w:t>
+            </w:r>
+            <w:r>
+              <w:t xml:space="preserve"> </w:t>
+            </w:r>
+            <w:r>
+              <w:t>reveal mastery.</w:t>
+            </w:r>
+            <w:r>
+              <w:t xml:space="preserve"> </w:t>
+            </w:r>
+            <w:r>
+              <w:t>b)</w:t>
+            </w:r>
+            <w:r>
+              <w:t xml:space="preserve"> end-of-sentence punctuation that is usually correct</w:t>
+            </w:r>
+            <w:r>
+              <w:t>,</w:t>
+            </w:r>
+            <w:r>
+              <w:t xml:space="preserve"> however, internal punctuation</w:t>
+            </w:r>
+            <w:r>
+              <w:t xml:space="preserve"> </w:t>
+            </w:r>
+            <w:r>
+              <w:t>contains frequent errors.</w:t>
+            </w:r>
+            <w:r>
+              <w:t xml:space="preserve"> </w:t>
+            </w:r>
+            <w:r>
+              <w:t xml:space="preserve">c) </w:t>
+            </w:r>
+            <w:r>
+              <w:t>spelling errors that distract the reader</w:t>
+            </w:r>
+            <w:r>
+              <w:t>,</w:t>
+            </w:r>
+            <w:r>
+              <w:t xml:space="preserve"> </w:t>
             </w:r>
             <w:r>
               <w:lastRenderedPageBreak/>
-              <w:t>simple or too short to</w:t>
-            </w:r>
-          </w:p>
-          <w:p>
-            <w:r>
-              <w:t>reveal mastery.</w:t>
-            </w:r>
-          </w:p>
-          <w:p>
-            <w:r>
-              <w:t>b)</w:t>
-            </w:r>
-            <w:r>
-              <w:t xml:space="preserve"> end-of-sentence punctuation that is usually correct</w:t>
-            </w:r>
-            <w:r>
-              <w:t>,</w:t>
-            </w:r>
-            <w:r>
-              <w:t xml:space="preserve"> however, internal punctuation</w:t>
-            </w:r>
-          </w:p>
-          <w:p>
-            <w:r>
-              <w:t>contains frequent errors.</w:t>
-            </w:r>
-          </w:p>
-          <w:p>
-            <w:r>
-              <w:t xml:space="preserve">c) </w:t>
-            </w:r>
-            <w:r>
-              <w:t>spelling errors that distract the reader</w:t>
-            </w:r>
-            <w:r>
-              <w:t>,</w:t>
-            </w:r>
-            <w:r>
-              <w:t xml:space="preserve"> misspelling of common words occurs.</w:t>
-            </w:r>
-          </w:p>
-          <w:p>
+              <w:t>misspelling of common words occurs.</w:t>
+            </w:r>
+            <w:r>
+              <w:t xml:space="preserve"> </w:t>
+            </w:r>
             <w:r>
               <w:t>d)</w:t>
             </w:r>
             <w:r>
               <w:t xml:space="preserve"> capitalization errors.</w:t>
             </w:r>
-          </w:p>
-          <w:p>
+            <w:r>
+              <w:t xml:space="preserve"> </w:t>
+            </w:r>
             <w:r>
               <w:t>e)</w:t>
             </w:r>
             <w:r>
               <w:t xml:space="preserve"> errors in grammar and usage that do not block meaning but do distract the</w:t>
             </w:r>
-          </w:p>
-          <w:p>
+            <w:r>
+              <w:t xml:space="preserve"> </w:t>
+            </w:r>
             <w:r>
               <w:t>reader.</w:t>
             </w:r>
-          </w:p>
-          <w:p>
+            <w:r>
+              <w:t xml:space="preserve"> </w:t>
+            </w:r>
             <w:r>
               <w:t>f)</w:t>
             </w:r>
@@ -2151,87 +2342,100 @@
               <w:lastRenderedPageBreak/>
               <w:t>The writing demonstrates control of standard writing conventions (e.g., punctuation,</w:t>
             </w:r>
-          </w:p>
-          <w:p>
+            <w:r>
+              <w:t xml:space="preserve"> </w:t>
+            </w:r>
             <w:r>
               <w:t>spelling, capitalization, grammar and usage). Significant errors do not occur frequently. Minor</w:t>
             </w:r>
-          </w:p>
-          <w:p>
+            <w:r>
+              <w:t xml:space="preserve"> </w:t>
+            </w:r>
             <w:r>
               <w:t>errors, while perhaps noticeable, do not impede readability. The writing is characterized by</w:t>
             </w:r>
-          </w:p>
-          <w:p>
+            <w:r>
+              <w:t xml:space="preserve"> </w:t>
+            </w:r>
+            <w:r>
+              <w:t>a)</w:t>
+            </w:r>
+            <w:r>
+              <w:t xml:space="preserve"> control over conventions used, although a wide range is not demonstrated.</w:t>
+            </w:r>
+            <w:r>
+              <w:t xml:space="preserve"> </w:t>
+            </w:r>
+            <w:r>
+              <w:t>b)</w:t>
+            </w:r>
+            <w:r>
+              <w:t xml:space="preserve"> correct end-of-sentence punctuation</w:t>
+            </w:r>
+            <w:r>
+              <w:t>,</w:t>
+            </w:r>
+            <w:r>
+              <w:t xml:space="preserve"> internal punctuation may sometimes be</w:t>
+            </w:r>
+            <w:r>
+              <w:t xml:space="preserve"> </w:t>
+            </w:r>
+            <w:r>
+              <w:t>incorrect.</w:t>
+            </w:r>
+            <w:r>
+              <w:t xml:space="preserve"> </w:t>
+            </w:r>
+            <w:r>
+              <w:t>c)</w:t>
+            </w:r>
+            <w:r>
+              <w:t xml:space="preserve"> spelling </w:t>
+            </w:r>
             <w:r>
               <w:lastRenderedPageBreak/>
-              <w:t>a)</w:t>
-            </w:r>
-            <w:r>
-              <w:t xml:space="preserve"> control over conventions used, although a wide range is not demonstrated.</w:t>
-            </w:r>
-          </w:p>
-          <w:p>
-            <w:r>
-              <w:t>b)</w:t>
-            </w:r>
-            <w:r>
-              <w:t xml:space="preserve"> correct end-of-sentence punctuation</w:t>
+              <w:t>that is usually correct, especially on common words.</w:t>
+            </w:r>
+            <w:r>
+              <w:t xml:space="preserve"> </w:t>
+            </w:r>
+            <w:r>
+              <w:t>d)</w:t>
+            </w:r>
+            <w:r>
+              <w:t xml:space="preserve"> correct capitalization</w:t>
             </w:r>
             <w:r>
               <w:t>,</w:t>
             </w:r>
             <w:r>
-              <w:t xml:space="preserve"> internal punctuation may sometimes be</w:t>
-            </w:r>
-          </w:p>
-          <w:p>
-            <w:r>
-              <w:t>incorrect.</w:t>
-            </w:r>
-          </w:p>
-          <w:p>
-            <w:r>
-              <w:t>c)</w:t>
-            </w:r>
-            <w:r>
-              <w:t xml:space="preserve"> spelling that is usually correct, especially on common words.</w:t>
-            </w:r>
-          </w:p>
-          <w:p>
-            <w:r>
-              <w:t>d)</w:t>
-            </w:r>
-            <w:r>
-              <w:t xml:space="preserve"> correct capitalization</w:t>
+              <w:t xml:space="preserve"> errors, if any, are minor.</w:t>
+            </w:r>
+            <w:r>
+              <w:t xml:space="preserve"> </w:t>
+            </w:r>
+            <w:r>
+              <w:t>e)</w:t>
+            </w:r>
+            <w:r>
+              <w:t xml:space="preserve"> occasional lapses in correct grammar and usage</w:t>
             </w:r>
             <w:r>
               <w:t>,</w:t>
             </w:r>
             <w:r>
-              <w:t xml:space="preserve"> errors, if any, are minor.</w:t>
-            </w:r>
-          </w:p>
-          <w:p>
-            <w:r>
-              <w:t>e)</w:t>
-            </w:r>
-            <w:r>
-              <w:t xml:space="preserve"> occasional lapses in correct grammar and usage</w:t>
-            </w:r>
-            <w:r>
-              <w:t>,</w:t>
-            </w:r>
-            <w:r>
               <w:t xml:space="preserve"> problems are not severe</w:t>
             </w:r>
-          </w:p>
-          <w:p>
+            <w:r>
+              <w:t xml:space="preserve"> </w:t>
+            </w:r>
             <w:r>
               <w:t>enough to distort meaning or confuse the reader.</w:t>
             </w:r>
-          </w:p>
-          <w:p>
+            <w:r>
+              <w:t xml:space="preserve"> </w:t>
+            </w:r>
             <w:r>
               <w:t>f)</w:t>
             </w:r>
@@ -2249,53 +2453,63 @@
               <w:lastRenderedPageBreak/>
               <w:t>The writing demonstrates strong control of standard writing conventions (e.g.,</w:t>
             </w:r>
-          </w:p>
-          <w:p>
+            <w:r>
+              <w:t xml:space="preserve"> </w:t>
+            </w:r>
             <w:r>
               <w:t>punctuation, spelling, capitalization, grammar and usage) and uses them effectively to enhance</w:t>
             </w:r>
-          </w:p>
-          <w:p>
+            <w:r>
+              <w:t xml:space="preserve"> </w:t>
+            </w:r>
             <w:r>
               <w:t>communication. Errors are few and minor. Conventions support readability. The writing is</w:t>
             </w:r>
-          </w:p>
-          <w:p>
+            <w:r>
+              <w:t xml:space="preserve"> </w:t>
+            </w:r>
+            <w:r>
+              <w:t>characterized by</w:t>
+            </w:r>
+            <w:r>
+              <w:t xml:space="preserve"> </w:t>
+            </w:r>
+            <w:r>
+              <w:t>a)</w:t>
+            </w:r>
+            <w:r>
+              <w:t xml:space="preserve"> strong control of conventions.</w:t>
+            </w:r>
+            <w:r>
+              <w:t xml:space="preserve"> </w:t>
+            </w:r>
+            <w:r>
+              <w:t>b)</w:t>
+            </w:r>
+            <w:r>
+              <w:t xml:space="preserve"> effective use of punctuation that guides the reader through the text.</w:t>
+            </w:r>
+            <w:r>
+              <w:t xml:space="preserve"> </w:t>
+            </w:r>
+            <w:r>
+              <w:t>c)</w:t>
+            </w:r>
+            <w:r>
+              <w:t xml:space="preserve"> correct spelling, even of more difficult words.</w:t>
+            </w:r>
+            <w:r>
+              <w:t xml:space="preserve"> </w:t>
+            </w:r>
+            <w:r>
+              <w:t>d)</w:t>
+            </w:r>
+            <w:r>
+              <w:t xml:space="preserve"> correct </w:t>
+            </w:r>
             <w:r>
               <w:lastRenderedPageBreak/>
-              <w:t>characterized by</w:t>
-            </w:r>
-          </w:p>
-          <w:p>
-            <w:r>
-              <w:t>a)</w:t>
-            </w:r>
-            <w:r>
-              <w:t xml:space="preserve"> strong control of conventions.</w:t>
-            </w:r>
-          </w:p>
-          <w:p>
-            <w:r>
-              <w:t>b)</w:t>
-            </w:r>
-            <w:r>
-              <w:t xml:space="preserve"> effective use of punctuation that guides the reader through the text.</w:t>
-            </w:r>
-          </w:p>
-          <w:p>
-            <w:r>
-              <w:t>c)</w:t>
-            </w:r>
-            <w:r>
-              <w:t xml:space="preserve"> correct spelling, even of more difficult words.</w:t>
-            </w:r>
-          </w:p>
-          <w:p>
-            <w:r>
-              <w:t>d)</w:t>
-            </w:r>
-            <w:r>
-              <w:t xml:space="preserve"> correct capitalization</w:t>
+              <w:t>capitalization</w:t>
             </w:r>
             <w:r>
               <w:t>,</w:t>
@@ -2303,24 +2517,27 @@
             <w:r>
               <w:t xml:space="preserve"> errors, if any, are minor.</w:t>
             </w:r>
-          </w:p>
-          <w:p>
+            <w:r>
+              <w:t xml:space="preserve"> </w:t>
+            </w:r>
             <w:r>
               <w:t>e)</w:t>
             </w:r>
             <w:r>
               <w:t xml:space="preserve"> correct grammar and usage that contribute to clarity and style.</w:t>
             </w:r>
-          </w:p>
-          <w:p>
+            <w:r>
+              <w:t xml:space="preserve"> </w:t>
+            </w:r>
             <w:r>
               <w:t>f)</w:t>
             </w:r>
             <w:r>
               <w:t xml:space="preserve"> skill in using a wide range of conventions in a sufficiently long and complex piece.</w:t>
             </w:r>
-          </w:p>
-          <w:p>
+            <w:r>
+              <w:t xml:space="preserve"> </w:t>
+            </w:r>
             <w:r>
               <w:t>g)</w:t>
             </w:r>
@@ -2338,75 +2555,88 @@
               <w:lastRenderedPageBreak/>
               <w:t>The writing demonstrates exceptionally strong control of standard writing conventions</w:t>
             </w:r>
-          </w:p>
-          <w:p>
+            <w:r>
+              <w:t xml:space="preserve"> </w:t>
+            </w:r>
             <w:r>
               <w:t>(e.g., punctuation, spelling, capitalization, grammar and usage) and uses them effectively to</w:t>
             </w:r>
-          </w:p>
-          <w:p>
+            <w:r>
+              <w:t xml:space="preserve"> </w:t>
+            </w:r>
             <w:r>
               <w:t>enhance communication. Errors are so few and so minor that the reader can easily skim right</w:t>
             </w:r>
-          </w:p>
-          <w:p>
+            <w:r>
+              <w:t xml:space="preserve"> </w:t>
+            </w:r>
+            <w:r>
+              <w:t>over them unless specifically searching for them. The writing is characterized by</w:t>
+            </w:r>
+            <w:r>
+              <w:t xml:space="preserve"> </w:t>
+            </w:r>
+            <w:r>
+              <w:t>a)</w:t>
+            </w:r>
+            <w:r>
+              <w:t xml:space="preserve"> strong control of conventions</w:t>
+            </w:r>
+            <w:r>
+              <w:t>,</w:t>
+            </w:r>
+            <w:r>
+              <w:t xml:space="preserve"> manipulation of conventions may occur for stylistic</w:t>
+            </w:r>
+            <w:r>
+              <w:t xml:space="preserve"> </w:t>
+            </w:r>
+            <w:r>
+              <w:t>effect.</w:t>
+            </w:r>
+            <w:r>
+              <w:t xml:space="preserve"> </w:t>
+            </w:r>
+            <w:r>
+              <w:t>b)</w:t>
+            </w:r>
+            <w:r>
+              <w:t xml:space="preserve"> strong, </w:t>
+            </w:r>
             <w:r>
               <w:lastRenderedPageBreak/>
-              <w:t>over them unless specifically searching for them. The writing is characterized by</w:t>
-            </w:r>
-          </w:p>
-          <w:p>
-            <w:r>
-              <w:t>a)</w:t>
-            </w:r>
-            <w:r>
-              <w:t xml:space="preserve"> strong control of conventions</w:t>
-            </w:r>
-            <w:r>
-              <w:t>,</w:t>
-            </w:r>
-            <w:r>
-              <w:t xml:space="preserve"> manipulation of conventions may occur for stylistic</w:t>
-            </w:r>
-          </w:p>
-          <w:p>
-            <w:r>
-              <w:t>effect.</w:t>
-            </w:r>
-          </w:p>
-          <w:p>
-            <w:r>
-              <w:t>b)</w:t>
-            </w:r>
-            <w:r>
-              <w:t xml:space="preserve"> strong, effective use of punctuation that guides the reader through the text.</w:t>
-            </w:r>
-          </w:p>
-          <w:p>
+              <w:t>effective use of punctuation that guides the reader through the text.</w:t>
+            </w:r>
+            <w:r>
+              <w:t xml:space="preserve"> </w:t>
+            </w:r>
             <w:r>
               <w:t xml:space="preserve">c) </w:t>
             </w:r>
             <w:r>
               <w:t>correct spelling, even of more difficult words.</w:t>
             </w:r>
-          </w:p>
-          <w:p>
+            <w:r>
+              <w:t xml:space="preserve"> </w:t>
+            </w:r>
             <w:r>
               <w:t>d)</w:t>
             </w:r>
             <w:r>
               <w:t xml:space="preserve"> correct grammar and usage that contribute to clarity and style.</w:t>
             </w:r>
-          </w:p>
-          <w:p>
+            <w:r>
+              <w:t xml:space="preserve"> </w:t>
+            </w:r>
             <w:r>
               <w:t>e)</w:t>
             </w:r>
             <w:r>
               <w:t xml:space="preserve"> skill in using a wide range of conventions in a sufficiently long and complex piece.</w:t>
             </w:r>
-          </w:p>
-          <w:p>
+            <w:r>
+              <w:t xml:space="preserve"> </w:t>
+            </w:r>
             <w:r>
               <w:t>f)</w:t>
             </w:r>
@@ -2529,7 +2759,11 @@
         </w:tc>
       </w:tr>
     </w:tbl>
-    <w:p/>
+    <w:p>
+      <w:r>
+        <w:t xml:space="preserve"> </w:t>
+      </w:r>
+    </w:p>
     <w:sectPr>
       <w:pgSz w:w="20160" w:h="12240" w:orient="landscape" w:code="5"/>
       <w:pgMar w:top="720" w:right="720" w:bottom="720" w:left="720" w:header="708" w:footer="708" w:gutter="0"/>

</xml_diff>